<commit_message>
feat(documentos): hoja de instrucciones aparte y carta limpia en todos los Word del sitio
Cada documento de los kits, el pack de despido y los modelos gratuitos separa la
hoja de instrucciones (marca, guia de uso, lista de revision) de la pagina 1 del
documento de trabajo, que empieza limpio en la pagina 2 sin marca ni notas internas
ni pie de pagina. Los campos [ ... ] se resaltan en amarillo. El pack de despido pasa
al estilo verde de los kits. Kit Datos: se quita la linea de marca de cada documento.
La pagina de venta del pack muestra las dos paginas con pestañas.

Co-Authored-By: Claude Sonnet 5.5 <noreply@anthropic.com>
</commit_message>
<xml_diff>
--- a/api/assets/kit_datos_files/1_Anexo_Laboral_Datos_Personales_Ley_21719.docx
+++ b/api/assets/kit_datos_files/1_Anexo_Laboral_Datos_Personales_Ley_21719.docx
@@ -2,30 +2,6 @@
 <file path=word/document.xml><?xml version="1.0" encoding="utf-8"?>
 <w:document xmlns:wpc="http://schemas.microsoft.com/office/word/2010/wordprocessingCanvas" xmlns:mo="http://schemas.microsoft.com/office/mac/office/2008/main" xmlns:mc="http://schemas.openxmlformats.org/markup-compatibility/2006" xmlns:mv="urn:schemas-microsoft-com:mac:vml" xmlns:o="urn:schemas-microsoft-com:office:office" xmlns:r="http://schemas.openxmlformats.org/officeDocument/2006/relationships" xmlns:m="http://schemas.openxmlformats.org/officeDocument/2006/math" xmlns:v="urn:schemas-microsoft-com:vml" xmlns:wp14="http://schemas.microsoft.com/office/word/2010/wordprocessingDrawing" xmlns:wp="http://schemas.openxmlformats.org/drawingml/2006/wordprocessingDrawing" xmlns:w10="urn:schemas-microsoft-com:office:word" xmlns:w="http://schemas.openxmlformats.org/wordprocessingml/2006/main" xmlns:w14="http://schemas.microsoft.com/office/word/2010/wordml" xmlns:wpg="http://schemas.microsoft.com/office/word/2010/wordprocessingGroup" xmlns:wpi="http://schemas.microsoft.com/office/word/2010/wordprocessingInk" xmlns:wne="http://schemas.microsoft.com/office/word/2006/wordml" xmlns:wps="http://schemas.microsoft.com/office/word/2010/wordprocessingShape" mc:Ignorable="w14 wp14">
   <w:body>
-    <w:p>
-      <w:pPr>
-        <w:spacing w:after="200" w:before="0"/>
-        <w:jc w:val="left"/>
-      </w:pPr>
-      <w:r>
-        <w:rPr>
-          <w:rFonts w:ascii="Calibri" w:hAnsi="Calibri"/>
-          <w:b/>
-          <w:color w:val="00382E"/>
-          <w:sz w:val="17"/>
-        </w:rPr>
-        <w:t>CálculoLaboral.cl</w:t>
-        <w:br/>
-      </w:r>
-      <w:r>
-        <w:rPr>
-          <w:rFonts w:ascii="Calibri" w:hAnsi="Calibri"/>
-          <w:color w:val="64748B"/>
-          <w:sz w:val="17"/>
-        </w:rPr>
-        <w:t>Kit Ley N° 21.719 de Protección de Datos Personales  •  Documento 1  •  Formato Word Editable (.docx)</w:t>
-      </w:r>
-    </w:p>
     <w:p>
       <w:pPr>
         <w:keepNext/>
@@ -71,7 +47,41 @@
           <w:color w:val="1E293B"/>
           <w:sz w:val="19"/>
         </w:rPr>
-        <w:t>En [CIUDAD], a [FECHA ACTUAL], entre:</w:t>
+        <w:t xml:space="preserve">En </w:t>
+      </w:r>
+      <w:r>
+        <w:rPr>
+          <w:rFonts w:ascii="Calibri" w:hAnsi="Calibri"/>
+          <w:color w:val="1E293B"/>
+          <w:sz w:val="19"/>
+          <w:highlight w:val="yellow"/>
+        </w:rPr>
+        <w:t xml:space="preserve">[CIUDAD]</w:t>
+      </w:r>
+      <w:r>
+        <w:rPr>
+          <w:rFonts w:ascii="Calibri" w:hAnsi="Calibri"/>
+          <w:color w:val="1E293B"/>
+          <w:sz w:val="19"/>
+        </w:rPr>
+        <w:t xml:space="preserve">, a </w:t>
+      </w:r>
+      <w:r>
+        <w:rPr>
+          <w:rFonts w:ascii="Calibri" w:hAnsi="Calibri"/>
+          <w:color w:val="1E293B"/>
+          <w:sz w:val="19"/>
+          <w:highlight w:val="yellow"/>
+        </w:rPr>
+        <w:t xml:space="preserve">[FECHA ACTUAL]</w:t>
+      </w:r>
+      <w:r>
+        <w:rPr>
+          <w:rFonts w:ascii="Calibri" w:hAnsi="Calibri"/>
+          <w:color w:val="1E293B"/>
+          <w:sz w:val="19"/>
+        </w:rPr>
+        <w:t xml:space="preserve">, entre:</w:t>
       </w:r>
     </w:p>
     <w:p>
@@ -85,7 +95,41 @@
           <w:color w:val="1E293B"/>
           <w:sz w:val="19"/>
         </w:rPr>
-        <w:t>1. [NOMBRE DE LA EMPRESA / RAZÓN SOCIAL], Rol Único Tributario N° [RUT EMPRESA], representada legalmente según consta en el contrato de trabajo principal, en adelante denominada indistintamente el 'Empleador' o el 'Responsable del Tratamiento'; y</w:t>
+        <w:t xml:space="preserve">1. </w:t>
+      </w:r>
+      <w:r>
+        <w:rPr>
+          <w:rFonts w:ascii="Calibri" w:hAnsi="Calibri"/>
+          <w:color w:val="1E293B"/>
+          <w:sz w:val="19"/>
+          <w:highlight w:val="yellow"/>
+        </w:rPr>
+        <w:t xml:space="preserve">[NOMBRE DE LA EMPRESA / RAZÓN SOCIAL]</w:t>
+      </w:r>
+      <w:r>
+        <w:rPr>
+          <w:rFonts w:ascii="Calibri" w:hAnsi="Calibri"/>
+          <w:color w:val="1E293B"/>
+          <w:sz w:val="19"/>
+        </w:rPr>
+        <w:t xml:space="preserve">, Rol Único Tributario N° </w:t>
+      </w:r>
+      <w:r>
+        <w:rPr>
+          <w:rFonts w:ascii="Calibri" w:hAnsi="Calibri"/>
+          <w:color w:val="1E293B"/>
+          <w:sz w:val="19"/>
+          <w:highlight w:val="yellow"/>
+        </w:rPr>
+        <w:t xml:space="preserve">[RUT EMPRESA]</w:t>
+      </w:r>
+      <w:r>
+        <w:rPr>
+          <w:rFonts w:ascii="Calibri" w:hAnsi="Calibri"/>
+          <w:color w:val="1E293B"/>
+          <w:sz w:val="19"/>
+        </w:rPr>
+        <w:t xml:space="preserve">, representada legalmente según consta en el contrato de trabajo principal, en adelante denominada indistintamente el 'Empleador' o el 'Responsable del Tratamiento'; y</w:t>
       </w:r>
     </w:p>
     <w:p>
@@ -99,7 +143,41 @@
           <w:color w:val="1E293B"/>
           <w:sz w:val="19"/>
         </w:rPr>
-        <w:t>2. Don/Doña [NOMBRE COMPLETO DEL TRABAJADOR], cédula nacional de identidad N° [RUT TRABAJADOR], en adelante denominado el 'Trabajador' o el 'Titular de los Datos';</w:t>
+        <w:t xml:space="preserve">2. Don/Doña </w:t>
+      </w:r>
+      <w:r>
+        <w:rPr>
+          <w:rFonts w:ascii="Calibri" w:hAnsi="Calibri"/>
+          <w:color w:val="1E293B"/>
+          <w:sz w:val="19"/>
+          <w:highlight w:val="yellow"/>
+        </w:rPr>
+        <w:t xml:space="preserve">[NOMBRE COMPLETO DEL TRABAJADOR]</w:t>
+      </w:r>
+      <w:r>
+        <w:rPr>
+          <w:rFonts w:ascii="Calibri" w:hAnsi="Calibri"/>
+          <w:color w:val="1E293B"/>
+          <w:sz w:val="19"/>
+        </w:rPr>
+        <w:t xml:space="preserve">, cédula nacional de identidad N° </w:t>
+      </w:r>
+      <w:r>
+        <w:rPr>
+          <w:rFonts w:ascii="Calibri" w:hAnsi="Calibri"/>
+          <w:color w:val="1E293B"/>
+          <w:sz w:val="19"/>
+          <w:highlight w:val="yellow"/>
+        </w:rPr>
+        <w:t xml:space="preserve">[RUT TRABAJADOR]</w:t>
+      </w:r>
+      <w:r>
+        <w:rPr>
+          <w:rFonts w:ascii="Calibri" w:hAnsi="Calibri"/>
+          <w:color w:val="1E293B"/>
+          <w:sz w:val="19"/>
+        </w:rPr>
+        <w:t xml:space="preserve">, en adelante denominado el 'Trabajador' o el 'Titular de los Datos';</w:t>
       </w:r>
     </w:p>
     <w:p>
@@ -537,8 +615,16 @@
                 <w:rFonts w:ascii="Calibri" w:hAnsi="Calibri" w:cs="Calibri"/>
                 <w:b/>
                 <w:sz w:val="18"/>
+                <w:highlight w:val="yellow"/>
               </w:rPr>
-              <w:t>[NOMBRE DE LA EMPRESA / RAZÓN SOCIAL]</w:t>
+              <w:t xml:space="preserve">[NOMBRE DE LA EMPRESA / RAZÓN SOCIAL]</w:t>
+            </w:r>
+            <w:r>
+              <w:rPr>
+                <w:rFonts w:ascii="Calibri" w:hAnsi="Calibri" w:cs="Calibri"/>
+                <w:b/>
+                <w:sz w:val="18"/>
+              </w:rPr>
               <w:br/>
             </w:r>
             <w:r>
@@ -547,9 +633,32 @@
                 <w:color w:val="475569"/>
                 <w:sz w:val="16"/>
               </w:rPr>
-              <w:t>RUT N° [RUT EMPRESA]</w:t>
+              <w:t xml:space="preserve">RUT N° </w:t>
+            </w:r>
+            <w:r>
+              <w:rPr>
+                <w:rFonts w:ascii="Calibri" w:hAnsi="Calibri" w:cs="Calibri"/>
+                <w:color w:val="475569"/>
+                <w:sz w:val="16"/>
+                <w:highlight w:val="yellow"/>
+              </w:rPr>
+              <w:t xml:space="preserve">[RUT EMPRESA]</w:t>
+            </w:r>
+            <w:r>
+              <w:rPr>
+                <w:rFonts w:ascii="Calibri" w:hAnsi="Calibri" w:cs="Calibri"/>
+                <w:color w:val="475569"/>
+                <w:sz w:val="16"/>
+              </w:rPr>
               <w:br/>
-              <w:t>EMPLEADOR / RESPONSABLE</w:t>
+            </w:r>
+            <w:r>
+              <w:rPr>
+                <w:rFonts w:ascii="Calibri" w:hAnsi="Calibri" w:cs="Calibri"/>
+                <w:color w:val="475569"/>
+                <w:sz w:val="16"/>
+              </w:rPr>
+              <w:t xml:space="preserve">EMPLEADOR / RESPONSABLE</w:t>
             </w:r>
           </w:p>
         </w:tc>
@@ -574,8 +683,16 @@
                 <w:rFonts w:ascii="Calibri" w:hAnsi="Calibri" w:cs="Calibri"/>
                 <w:b/>
                 <w:sz w:val="18"/>
+                <w:highlight w:val="yellow"/>
               </w:rPr>
-              <w:t>[NOMBRE DEL TRABAJADOR]</w:t>
+              <w:t xml:space="preserve">[NOMBRE DEL TRABAJADOR]</w:t>
+            </w:r>
+            <w:r>
+              <w:rPr>
+                <w:rFonts w:ascii="Calibri" w:hAnsi="Calibri" w:cs="Calibri"/>
+                <w:b/>
+                <w:sz w:val="18"/>
+              </w:rPr>
               <w:br/>
             </w:r>
             <w:r>
@@ -584,9 +701,32 @@
                 <w:color w:val="475569"/>
                 <w:sz w:val="16"/>
               </w:rPr>
-              <w:t>C.I. N° [RUT TRABAJADOR]</w:t>
+              <w:t xml:space="preserve">C.I. N° </w:t>
+            </w:r>
+            <w:r>
+              <w:rPr>
+                <w:rFonts w:ascii="Calibri" w:hAnsi="Calibri" w:cs="Calibri"/>
+                <w:color w:val="475569"/>
+                <w:sz w:val="16"/>
+                <w:highlight w:val="yellow"/>
+              </w:rPr>
+              <w:t xml:space="preserve">[RUT TRABAJADOR]</w:t>
+            </w:r>
+            <w:r>
+              <w:rPr>
+                <w:rFonts w:ascii="Calibri" w:hAnsi="Calibri" w:cs="Calibri"/>
+                <w:color w:val="475569"/>
+                <w:sz w:val="16"/>
+              </w:rPr>
               <w:br/>
-              <w:t>TRABAJADOR / TITULAR DE DATOS</w:t>
+            </w:r>
+            <w:r>
+              <w:rPr>
+                <w:rFonts w:ascii="Calibri" w:hAnsi="Calibri" w:cs="Calibri"/>
+                <w:color w:val="475569"/>
+                <w:sz w:val="16"/>
+              </w:rPr>
+              <w:t xml:space="preserve">TRABAJADOR / TITULAR DE DATOS</w:t>
             </w:r>
           </w:p>
         </w:tc>

</xml_diff>